<commit_message>
Translate all dashboard UI texts, alert notifications, and academic proposal (MD and DOCX) to strict English for repository consistency
</commit_message>
<xml_diff>
--- a/PROPOSAL.docx
+++ b/PROPOSAL.docx
@@ -71,7 +71,7 @@
           <w:color w:val="102C57"/>
           <w:sz w:val="28"/>
         </w:rPr>
-        <w:t>1. Executive Summary (Ringkasan Eksekutif)</w:t>
+        <w:t>1. Executive Summary</w:t>
       </w:r>
     </w:p>
     <w:p>
@@ -89,7 +89,7 @@
           <w:color w:val="102C57"/>
           <w:sz w:val="28"/>
         </w:rPr>
-        <w:t>2. Problem Statement (Penyataan Masalah)</w:t>
+        <w:t>2. Problem Statement</w:t>
       </w:r>
     </w:p>
     <w:p>
@@ -110,7 +110,7 @@
           <w:color w:val="102C57"/>
           <w:sz w:val="28"/>
         </w:rPr>
-        <w:t>3. Project Objectives (Objektif Projek)</w:t>
+        <w:t>3. Project Objectives</w:t>
       </w:r>
     </w:p>
     <w:p>

</xml_diff>

<commit_message>
Update systems architecture diagram flowchart inside README and PROPOSAL and embed the visual image inside the compiled PROPOSAL.docx
</commit_message>
<xml_diff>
--- a/PROPOSAL.docx
+++ b/PROPOSAL.docx
@@ -139,8 +139,46 @@
     <w:p>
       <w:r>
         <w:t>GhostEye utilizes a 3-tier architecture: the Client IDE Agent, the FastAPI Backend Gateway, and the Web SIEM Frontend.</w:t>
-        <w:br/>
-        <w:br/>
+      </w:r>
+    </w:p>
+    <w:p>
+      <w:r>
+        <w:drawing>
+          <wp:inline xmlns:a="http://schemas.openxmlformats.org/drawingml/2006/main" xmlns:pic="http://schemas.openxmlformats.org/drawingml/2006/picture">
+            <wp:extent cx="5029200" cy="5029200"/>
+            <wp:docPr id="1" name="Picture 1"/>
+            <wp:cNvGraphicFramePr>
+              <a:graphicFrameLocks noChangeAspect="1"/>
+            </wp:cNvGraphicFramePr>
+            <a:graphic>
+              <a:graphicData uri="http://schemas.openxmlformats.org/drawingml/2006/picture">
+                <pic:pic>
+                  <pic:nvPicPr>
+                    <pic:cNvPr id="0" name="ghosteye_architecture.png"/>
+                    <pic:cNvPicPr/>
+                  </pic:nvPicPr>
+                  <pic:blipFill>
+                    <a:blip r:embed="rId9"/>
+                    <a:stretch>
+                      <a:fillRect/>
+                    </a:stretch>
+                  </pic:blipFill>
+                  <pic:spPr>
+                    <a:xfrm>
+                      <a:off x="0" y="0"/>
+                      <a:ext cx="5029200" cy="5029200"/>
+                    </a:xfrm>
+                    <a:prstGeom prst="rect"/>
+                  </pic:spPr>
+                </pic:pic>
+              </a:graphicData>
+            </a:graphic>
+          </wp:inline>
+        </w:drawing>
+      </w:r>
+    </w:p>
+    <w:p>
+      <w:r>
         <w:t>A. Dual Hash Signatures:</w:t>
         <w:br/>
         <w:t>The compiler agent generates two hashes simultaneously from the code buffer:</w:t>

</xml_diff>

<commit_message>
Update system architecture diagram and document schemas for final presentation
</commit_message>
<xml_diff>
--- a/PROPOSAL.docx
+++ b/PROPOSAL.docx
@@ -175,6 +175,725 @@
             </a:graphic>
           </wp:inline>
         </w:drawing>
+      </w:r>
+    </w:p>
+    <w:p>
+      <w:r>
+        <w:rPr>
+          <w:b/>
+          <w:color w:val="102C57"/>
+          <w:sz w:val="24"/>
+        </w:rPr>
+        <w:t>4.1 Telemetry Database Schema (SQLite ERD)</w:t>
+      </w:r>
+    </w:p>
+    <w:p>
+      <w:r>
+        <w:t>To support client analysis, location plotting, and threat intelligence mapping, the server maintains the following telemetry structure within its SQLite database:</w:t>
+      </w:r>
+    </w:p>
+    <w:tbl>
+      <w:tblPr>
+        <w:tblStyle w:val="TableGrid"/>
+        <w:tblW w:type="auto" w:w="0"/>
+        <w:tblLook w:firstColumn="1" w:firstRow="1" w:lastColumn="0" w:lastRow="0" w:noHBand="0" w:noVBand="1" w:val="04A0"/>
+      </w:tblPr>
+      <w:tblGrid>
+        <w:gridCol w:w="2880"/>
+        <w:gridCol w:w="2880"/>
+        <w:gridCol w:w="2880"/>
+      </w:tblGrid>
+      <w:tr>
+        <w:tc>
+          <w:tcPr>
+            <w:tcW w:type="dxa" w:w="2880"/>
+          </w:tcPr>
+          <w:p>
+            <w:r>
+              <w:rPr>
+                <w:b/>
+              </w:rPr>
+              <w:t>Field Name</w:t>
+            </w:r>
+          </w:p>
+        </w:tc>
+        <w:tc>
+          <w:tcPr>
+            <w:tcW w:type="dxa" w:w="2880"/>
+          </w:tcPr>
+          <w:p>
+            <w:r>
+              <w:rPr>
+                <w:b/>
+              </w:rPr>
+              <w:t>Data Type</w:t>
+            </w:r>
+          </w:p>
+        </w:tc>
+        <w:tc>
+          <w:tcPr>
+            <w:tcW w:type="dxa" w:w="2880"/>
+          </w:tcPr>
+          <w:p>
+            <w:r>
+              <w:rPr>
+                <w:b/>
+              </w:rPr>
+              <w:t>Description</w:t>
+            </w:r>
+          </w:p>
+        </w:tc>
+      </w:tr>
+      <w:tr>
+        <w:tc>
+          <w:tcPr>
+            <w:tcW w:type="dxa" w:w="2880"/>
+          </w:tcPr>
+          <w:p>
+            <w:r>
+              <w:t>id</w:t>
+            </w:r>
+          </w:p>
+        </w:tc>
+        <w:tc>
+          <w:tcPr>
+            <w:tcW w:type="dxa" w:w="2880"/>
+          </w:tcPr>
+          <w:p>
+            <w:r>
+              <w:t>INTEGER (PK)</w:t>
+            </w:r>
+          </w:p>
+        </w:tc>
+        <w:tc>
+          <w:tcPr>
+            <w:tcW w:type="dxa" w:w="2880"/>
+          </w:tcPr>
+          <w:p>
+            <w:r>
+              <w:t>Auto-increment primary key for log entry identification.</w:t>
+            </w:r>
+          </w:p>
+        </w:tc>
+      </w:tr>
+      <w:tr>
+        <w:tc>
+          <w:tcPr>
+            <w:tcW w:type="dxa" w:w="2880"/>
+          </w:tcPr>
+          <w:p>
+            <w:r>
+              <w:t>timestamp</w:t>
+            </w:r>
+          </w:p>
+        </w:tc>
+        <w:tc>
+          <w:tcPr>
+            <w:tcW w:type="dxa" w:w="2880"/>
+          </w:tcPr>
+          <w:p>
+            <w:r>
+              <w:t>TEXT</w:t>
+            </w:r>
+          </w:p>
+        </w:tc>
+        <w:tc>
+          <w:tcPr>
+            <w:tcW w:type="dxa" w:w="2880"/>
+          </w:tcPr>
+          <w:p>
+            <w:r>
+              <w:t>ISO-8601 formatted UTC timestamp of compile execution on the client.</w:t>
+            </w:r>
+          </w:p>
+        </w:tc>
+      </w:tr>
+      <w:tr>
+        <w:tc>
+          <w:tcPr>
+            <w:tcW w:type="dxa" w:w="2880"/>
+          </w:tcPr>
+          <w:p>
+            <w:r>
+              <w:t>received_at</w:t>
+            </w:r>
+          </w:p>
+        </w:tc>
+        <w:tc>
+          <w:tcPr>
+            <w:tcW w:type="dxa" w:w="2880"/>
+          </w:tcPr>
+          <w:p>
+            <w:r>
+              <w:t>TEXT</w:t>
+            </w:r>
+          </w:p>
+        </w:tc>
+        <w:tc>
+          <w:tcPr>
+            <w:tcW w:type="dxa" w:w="2880"/>
+          </w:tcPr>
+          <w:p>
+            <w:r>
+              <w:t>ISO-8601 formatted UTC timestamp of server log ingestion.</w:t>
+            </w:r>
+          </w:p>
+        </w:tc>
+      </w:tr>
+      <w:tr>
+        <w:tc>
+          <w:tcPr>
+            <w:tcW w:type="dxa" w:w="2880"/>
+          </w:tcPr>
+          <w:p>
+            <w:r>
+              <w:t>filename</w:t>
+            </w:r>
+          </w:p>
+        </w:tc>
+        <w:tc>
+          <w:tcPr>
+            <w:tcW w:type="dxa" w:w="2880"/>
+          </w:tcPr>
+          <w:p>
+            <w:r>
+              <w:t>TEXT</w:t>
+            </w:r>
+          </w:p>
+        </w:tc>
+        <w:tc>
+          <w:tcPr>
+            <w:tcW w:type="dxa" w:w="2880"/>
+          </w:tcPr>
+          <w:p>
+            <w:r>
+              <w:t>Name of the source code file compiled.</w:t>
+            </w:r>
+          </w:p>
+        </w:tc>
+      </w:tr>
+      <w:tr>
+        <w:tc>
+          <w:tcPr>
+            <w:tcW w:type="dxa" w:w="2880"/>
+          </w:tcPr>
+          <w:p>
+            <w:r>
+              <w:t>filesize</w:t>
+            </w:r>
+          </w:p>
+        </w:tc>
+        <w:tc>
+          <w:tcPr>
+            <w:tcW w:type="dxa" w:w="2880"/>
+          </w:tcPr>
+          <w:p>
+            <w:r>
+              <w:t>INTEGER</w:t>
+            </w:r>
+          </w:p>
+        </w:tc>
+        <w:tc>
+          <w:tcPr>
+            <w:tcW w:type="dxa" w:w="2880"/>
+          </w:tcPr>
+          <w:p>
+            <w:r>
+              <w:t>Total size of the source file in bytes.</w:t>
+            </w:r>
+          </w:p>
+        </w:tc>
+      </w:tr>
+      <w:tr>
+        <w:tc>
+          <w:tcPr>
+            <w:tcW w:type="dxa" w:w="2880"/>
+          </w:tcPr>
+          <w:p>
+            <w:r>
+              <w:t>filehash_sha256</w:t>
+            </w:r>
+          </w:p>
+        </w:tc>
+        <w:tc>
+          <w:tcPr>
+            <w:tcW w:type="dxa" w:w="2880"/>
+          </w:tcPr>
+          <w:p>
+            <w:r>
+              <w:t>TEXT</w:t>
+            </w:r>
+          </w:p>
+        </w:tc>
+        <w:tc>
+          <w:tcPr>
+            <w:tcW w:type="dxa" w:w="2880"/>
+          </w:tcPr>
+          <w:p>
+            <w:r>
+              <w:t>SHA-256 cryptographic checksum of code byte buffer.</w:t>
+            </w:r>
+          </w:p>
+        </w:tc>
+      </w:tr>
+      <w:tr>
+        <w:tc>
+          <w:tcPr>
+            <w:tcW w:type="dxa" w:w="2880"/>
+          </w:tcPr>
+          <w:p>
+            <w:r>
+              <w:t>filehash_md5</w:t>
+            </w:r>
+          </w:p>
+        </w:tc>
+        <w:tc>
+          <w:tcPr>
+            <w:tcW w:type="dxa" w:w="2880"/>
+          </w:tcPr>
+          <w:p>
+            <w:r>
+              <w:t>TEXT</w:t>
+            </w:r>
+          </w:p>
+        </w:tc>
+        <w:tc>
+          <w:tcPr>
+            <w:tcW w:type="dxa" w:w="2880"/>
+          </w:tcPr>
+          <w:p>
+            <w:r>
+              <w:t>MD5 cryptographic checksum of code byte buffer.</w:t>
+            </w:r>
+          </w:p>
+        </w:tc>
+      </w:tr>
+      <w:tr>
+        <w:tc>
+          <w:tcPr>
+            <w:tcW w:type="dxa" w:w="2880"/>
+          </w:tcPr>
+          <w:p>
+            <w:r>
+              <w:t>compiler_flags</w:t>
+            </w:r>
+          </w:p>
+        </w:tc>
+        <w:tc>
+          <w:tcPr>
+            <w:tcW w:type="dxa" w:w="2880"/>
+          </w:tcPr>
+          <w:p>
+            <w:r>
+              <w:t>TEXT</w:t>
+            </w:r>
+          </w:p>
+        </w:tc>
+        <w:tc>
+          <w:tcPr>
+            <w:tcW w:type="dxa" w:w="2880"/>
+          </w:tcPr>
+          <w:p>
+            <w:r>
+              <w:t>Optimization, debugging, and warning flags configuration.</w:t>
+            </w:r>
+          </w:p>
+        </w:tc>
+      </w:tr>
+      <w:tr>
+        <w:tc>
+          <w:tcPr>
+            <w:tcW w:type="dxa" w:w="2880"/>
+          </w:tcPr>
+          <w:p>
+            <w:r>
+              <w:t>ip</w:t>
+            </w:r>
+          </w:p>
+        </w:tc>
+        <w:tc>
+          <w:tcPr>
+            <w:tcW w:type="dxa" w:w="2880"/>
+          </w:tcPr>
+          <w:p>
+            <w:r>
+              <w:t>TEXT</w:t>
+            </w:r>
+          </w:p>
+        </w:tc>
+        <w:tc>
+          <w:tcPr>
+            <w:tcW w:type="dxa" w:w="2880"/>
+          </w:tcPr>
+          <w:p>
+            <w:r>
+              <w:t>External IP address of compiling workstation.</w:t>
+            </w:r>
+          </w:p>
+        </w:tc>
+      </w:tr>
+      <w:tr>
+        <w:tc>
+          <w:tcPr>
+            <w:tcW w:type="dxa" w:w="2880"/>
+          </w:tcPr>
+          <w:p>
+            <w:r>
+              <w:t>country</w:t>
+            </w:r>
+          </w:p>
+        </w:tc>
+        <w:tc>
+          <w:tcPr>
+            <w:tcW w:type="dxa" w:w="2880"/>
+          </w:tcPr>
+          <w:p>
+            <w:r>
+              <w:t>TEXT</w:t>
+            </w:r>
+          </w:p>
+        </w:tc>
+        <w:tc>
+          <w:tcPr>
+            <w:tcW w:type="dxa" w:w="2880"/>
+          </w:tcPr>
+          <w:p>
+            <w:r>
+              <w:t>Geographic country resolved via GeoIP APIs.</w:t>
+            </w:r>
+          </w:p>
+        </w:tc>
+      </w:tr>
+      <w:tr>
+        <w:tc>
+          <w:tcPr>
+            <w:tcW w:type="dxa" w:w="2880"/>
+          </w:tcPr>
+          <w:p>
+            <w:r>
+              <w:t>city</w:t>
+            </w:r>
+          </w:p>
+        </w:tc>
+        <w:tc>
+          <w:tcPr>
+            <w:tcW w:type="dxa" w:w="2880"/>
+          </w:tcPr>
+          <w:p>
+            <w:r>
+              <w:t>TEXT</w:t>
+            </w:r>
+          </w:p>
+        </w:tc>
+        <w:tc>
+          <w:tcPr>
+            <w:tcW w:type="dxa" w:w="2880"/>
+          </w:tcPr>
+          <w:p>
+            <w:r>
+              <w:t>Geographic city resolved via GeoIP APIs.</w:t>
+            </w:r>
+          </w:p>
+        </w:tc>
+      </w:tr>
+      <w:tr>
+        <w:tc>
+          <w:tcPr>
+            <w:tcW w:type="dxa" w:w="2880"/>
+          </w:tcPr>
+          <w:p>
+            <w:r>
+              <w:t>latitude</w:t>
+            </w:r>
+          </w:p>
+        </w:tc>
+        <w:tc>
+          <w:tcPr>
+            <w:tcW w:type="dxa" w:w="2880"/>
+          </w:tcPr>
+          <w:p>
+            <w:r>
+              <w:t>REAL</w:t>
+            </w:r>
+          </w:p>
+        </w:tc>
+        <w:tc>
+          <w:tcPr>
+            <w:tcW w:type="dxa" w:w="2880"/>
+          </w:tcPr>
+          <w:p>
+            <w:r>
+              <w:t>Resolved location latitude coordinates for mapping.</w:t>
+            </w:r>
+          </w:p>
+        </w:tc>
+      </w:tr>
+      <w:tr>
+        <w:tc>
+          <w:tcPr>
+            <w:tcW w:type="dxa" w:w="2880"/>
+          </w:tcPr>
+          <w:p>
+            <w:r>
+              <w:t>longitude</w:t>
+            </w:r>
+          </w:p>
+        </w:tc>
+        <w:tc>
+          <w:tcPr>
+            <w:tcW w:type="dxa" w:w="2880"/>
+          </w:tcPr>
+          <w:p>
+            <w:r>
+              <w:t>REAL</w:t>
+            </w:r>
+          </w:p>
+        </w:tc>
+        <w:tc>
+          <w:tcPr>
+            <w:tcW w:type="dxa" w:w="2880"/>
+          </w:tcPr>
+          <w:p>
+            <w:r>
+              <w:t>Resolved location longitude coordinates for mapping.</w:t>
+            </w:r>
+          </w:p>
+        </w:tc>
+      </w:tr>
+      <w:tr>
+        <w:tc>
+          <w:tcPr>
+            <w:tcW w:type="dxa" w:w="2880"/>
+          </w:tcPr>
+          <w:p>
+            <w:r>
+              <w:t>hostname</w:t>
+            </w:r>
+          </w:p>
+        </w:tc>
+        <w:tc>
+          <w:tcPr>
+            <w:tcW w:type="dxa" w:w="2880"/>
+          </w:tcPr>
+          <w:p>
+            <w:r>
+              <w:t>TEXT</w:t>
+            </w:r>
+          </w:p>
+        </w:tc>
+        <w:tc>
+          <w:tcPr>
+            <w:tcW w:type="dxa" w:w="2880"/>
+          </w:tcPr>
+          <w:p>
+            <w:r>
+              <w:t>Host machine name identifier.</w:t>
+            </w:r>
+          </w:p>
+        </w:tc>
+      </w:tr>
+      <w:tr>
+        <w:tc>
+          <w:tcPr>
+            <w:tcW w:type="dxa" w:w="2880"/>
+          </w:tcPr>
+          <w:p>
+            <w:r>
+              <w:t>username</w:t>
+            </w:r>
+          </w:p>
+        </w:tc>
+        <w:tc>
+          <w:tcPr>
+            <w:tcW w:type="dxa" w:w="2880"/>
+          </w:tcPr>
+          <w:p>
+            <w:r>
+              <w:t>TEXT</w:t>
+            </w:r>
+          </w:p>
+        </w:tc>
+        <w:tc>
+          <w:tcPr>
+            <w:tcW w:type="dxa" w:w="2880"/>
+          </w:tcPr>
+          <w:p>
+            <w:r>
+              <w:t>Active developer profile username on operating system.</w:t>
+            </w:r>
+          </w:p>
+        </w:tc>
+      </w:tr>
+      <w:tr>
+        <w:tc>
+          <w:tcPr>
+            <w:tcW w:type="dxa" w:w="2880"/>
+          </w:tcPr>
+          <w:p>
+            <w:r>
+              <w:t>os_info</w:t>
+            </w:r>
+          </w:p>
+        </w:tc>
+        <w:tc>
+          <w:tcPr>
+            <w:tcW w:type="dxa" w:w="2880"/>
+          </w:tcPr>
+          <w:p>
+            <w:r>
+              <w:t>TEXT</w:t>
+            </w:r>
+          </w:p>
+        </w:tc>
+        <w:tc>
+          <w:tcPr>
+            <w:tcW w:type="dxa" w:w="2880"/>
+          </w:tcPr>
+          <w:p>
+            <w:r>
+              <w:t>Workstation OS build platform and architecture.</w:t>
+            </w:r>
+          </w:p>
+        </w:tc>
+      </w:tr>
+      <w:tr>
+        <w:tc>
+          <w:tcPr>
+            <w:tcW w:type="dxa" w:w="2880"/>
+          </w:tcPr>
+          <w:p>
+            <w:r>
+              <w:t>is_offline_log</w:t>
+            </w:r>
+          </w:p>
+        </w:tc>
+        <w:tc>
+          <w:tcPr>
+            <w:tcW w:type="dxa" w:w="2880"/>
+          </w:tcPr>
+          <w:p>
+            <w:r>
+              <w:t>INTEGER</w:t>
+            </w:r>
+          </w:p>
+        </w:tc>
+        <w:tc>
+          <w:tcPr>
+            <w:tcW w:type="dxa" w:w="2880"/>
+          </w:tcPr>
+          <w:p>
+            <w:r>
+              <w:t>Boolean status flag (0 = Live online sync, 1 = Cached offline).</w:t>
+            </w:r>
+          </w:p>
+        </w:tc>
+      </w:tr>
+      <w:tr>
+        <w:tc>
+          <w:tcPr>
+            <w:tcW w:type="dxa" w:w="2880"/>
+          </w:tcPr>
+          <w:p>
+            <w:r>
+              <w:t>status</w:t>
+            </w:r>
+          </w:p>
+        </w:tc>
+        <w:tc>
+          <w:tcPr>
+            <w:tcW w:type="dxa" w:w="2880"/>
+          </w:tcPr>
+          <w:p>
+            <w:r>
+              <w:t>TEXT</w:t>
+            </w:r>
+          </w:p>
+        </w:tc>
+        <w:tc>
+          <w:tcPr>
+            <w:tcW w:type="dxa" w:w="2880"/>
+          </w:tcPr>
+          <w:p>
+            <w:r>
+              <w:t>Outcome of compile process (SUCCESS or FAILED).</w:t>
+            </w:r>
+          </w:p>
+        </w:tc>
+      </w:tr>
+      <w:tr>
+        <w:tc>
+          <w:tcPr>
+            <w:tcW w:type="dxa" w:w="2880"/>
+          </w:tcPr>
+          <w:p>
+            <w:r>
+              <w:t>threat_level</w:t>
+            </w:r>
+          </w:p>
+        </w:tc>
+        <w:tc>
+          <w:tcPr>
+            <w:tcW w:type="dxa" w:w="2880"/>
+          </w:tcPr>
+          <w:p>
+            <w:r>
+              <w:t>TEXT</w:t>
+            </w:r>
+          </w:p>
+        </w:tc>
+        <w:tc>
+          <w:tcPr>
+            <w:tcW w:type="dxa" w:w="2880"/>
+          </w:tcPr>
+          <w:p>
+            <w:r>
+              <w:t>Risk level classification (INFO, LOW, MEDIUM, HIGH, CRITICAL).</w:t>
+            </w:r>
+          </w:p>
+        </w:tc>
+      </w:tr>
+    </w:tbl>
+    <w:p>
+      <w:r>
+        <w:br/>
+      </w:r>
+    </w:p>
+    <w:p>
+      <w:r>
+        <w:rPr>
+          <w:b/>
+          <w:color w:val="102C57"/>
+          <w:sz w:val="24"/>
+        </w:rPr>
+        <w:t>4.2 System Data Flow Sequence</w:t>
+      </w:r>
+    </w:p>
+    <w:p>
+      <w:r>
+        <w:t>1. Compilation Trigger: A developer compiles source code inside the Instrumented Compiler Agent.</w:t>
+        <w:br/>
+        <w:t>2. Intercept &amp; Keyword Check: The agent parses the buffer in-memory to look for Win32 API process injection markers.</w:t>
+        <w:br/>
+        <w:t>3. Signature Generation: Simultaneously, both MD5 and SHA-256 hashes of the code are generated.</w:t>
+        <w:br/>
+        <w:t>4. Transmission Decision:</w:t>
+        <w:br/>
+        <w:t xml:space="preserve">   - If Online: Telemetry payload is transmitted directly via an HTTP POST request to the Ingestion Gateway.</w:t>
+        <w:br/>
+        <w:t xml:space="preserve">   - If Offline: The payload is encrypted with an XOR+Base64 cipher, queued in 'offline_cache.json', and synced automatically by a background thread once connectivity returns.</w:t>
+        <w:br/>
+        <w:t>5. Gateway Security: The FastAPI backend verifies the 'X-GhostEye-Token' header. Unauthorized posts are blocked with 401 response.</w:t>
+        <w:br/>
+        <w:t>6. Location Resolution: The backend contacts a GeoIP provider to append country, city, and coordinates based on the source IP.</w:t>
+        <w:br/>
+        <w:t>7. Database Insertion: The compiled telemetry data is stored in 'telemetry.db'.</w:t>
+        <w:br/>
+        <w:t>8. SOC Visualization: The SIEM dashboard queries the backend API every 2 seconds, updating its Leaflet.js maps and Chart.js dashboards in real-time.</w:t>
+      </w:r>
+    </w:p>
+    <w:p>
+      <w:r>
+        <w:br/>
       </w:r>
     </w:p>
     <w:p>

</xml_diff>